<commit_message>
docs(tesis): actualizar ANTEPROYECTO.docx con benchmark SPY
Sincroniza el .docx con la corrección ya aplicada en ANTEPROYECTO.md:
SPY (S&P 500) como benchmark del portafolio y cifra de producción
+1,9% vs +10,6%. ECH/^DJI quedan como referencias del backtest.

Co-Authored-By: Claude Fable 5 <noreply@anthropic.com>
</commit_message>
<xml_diff>
--- a/docs/ANTEPROYECTO.docx
+++ b/docs/ANTEPROYECTO.docx
@@ -1297,7 +1297,7 @@
         <w:jc w:val="both"/>
       </w:pPr>
       <w:r>
-        <w:t xml:space="preserve">El universo de inversión está compuesto por seis acciones listadas en mercados estadounidenses —AAPL, GOOGL, MSFT, NVDA, TSLA y SQM (ADR chileno, que aporta el nexo con el mercado local)— y dos referencias de contexto: el ETF iShares MSCI Chile (ECH), utilizado como proxy del IPSA dado que Yahoo Finance descontinuó la serie ^IPSA en 2019, y el índice Dow Jones (^DJI). El portafolio simulado se constituyó el primer día hábil de 2026 con compras valorizadas al precio de cierre real de esa fecha, y su evolución diaria se reconstruye y actualiza con cierres reales de mercado, de modo que toda cifra exhibida por el sistema es verificable contra fuentes públicas.</w:t>
+        <w:t xml:space="preserve">El universo de inversión está compuesto por seis acciones listadas en mercados estadounidenses —AAPL, GOOGL, MSFT, NVDA, TSLA y SQM (ADR chileno, que aporta el nexo con el mercado local)— y tres referencias de mercado: el ETF SPDR S&amp;P 500 (SPY), utilizado como benchmark del portafolio por corresponder al mismo mercado en que cotizan los activos; y, como referencias comparativas del backtesting, el ETF iShares MSCI Chile (ECH) —proxy del IPSA dado que Yahoo Finance descontinuó la serie ^IPSA en 2019— y el índice Dow Jones (^DJI). El portafolio simulado se constituyó el primer día hábil de 2026 con compras valorizadas al precio de cierre real de esa fecha, y su evolución diaria se reconstruye y actualiza con cierres reales de mercado, de modo que toda cifra exhibida por el sistema es verificable contra fuentes públicas.</w:t>
       </w:r>
     </w:p>
     <w:p>
@@ -4031,7 +4031,7 @@
         <w:jc w:val="both"/>
       </w:pPr>
       <w:r>
-        <w:t xml:space="preserve">A la fecha de este anteproyecto, el sistema completo se encuentra desplegado y operativo: el backend sirve la inferencia de los cuatro modelos en producción, la aplicación web pública exhibe la documentación del proyecto y el portal operacional muestra datos vivos, el portafolio simulado se revaloriza diariamente con cierres reales de mercado (retorno acumulado desde inception el 2 de enero de 2026: +1,9% contra −0,2% del benchmark ECH al 6 de julio de 2026), y las tres tareas programadas diarias (predicciones, decisiones del agente, valorización) llevan más de tres semanas ejecutándose de forma autónoma sin intervención manual. Las decisiones diarias del agente se registran con su justificación redactada por Claude Haiku 4.5 y su nivel de confianza, consultables en el portal.</w:t>
+        <w:t xml:space="preserve">A la fecha de este anteproyecto, el sistema completo se encuentra desplegado y operativo: el backend sirve la inferencia de los cuatro modelos en producción, la aplicación web pública exhibe la documentación del proyecto y el portal operacional muestra datos vivos, el portafolio simulado se revaloriza diariamente con cierres reales de mercado (retorno acumulado desde inception el 2 de enero de 2026: +1,9% frente a +10,6% del benchmark S&amp;P 500 —ETF SPY— al 6 de julio de 2026, un período en que el portafolio quedó por debajo del índice de su mercado), y las tres tareas programadas diarias (predicciones, decisiones del agente, valorización) llevan más de tres semanas ejecutándose de forma autónoma sin intervención manual. Las decisiones diarias del agente se registran con su justificación redactada por Claude Haiku 4.5 y su nivel de confianza, consultables en el portal.</w:t>
       </w:r>
     </w:p>
     <w:p>

</xml_diff>